<commit_message>
Fix RTL alignment in Babaioff dean letter
Hebrew paragraphs relied on jc=right, which Word/LibreOffice interpret as
logical 'end' (physical left) inside an RTL (bidi) paragraph, so the whole
body rendered left-aligned. Drop jc from Hebrew body paragraphs to use the
RTL default (right); keep the date left-aligned (jc=right = physical left)
per the Stanovsky sample convention.

Co-Authored-By: Claude Opus 4.8 <noreply@anthropic.com>
</commit_message>
<xml_diff>
--- a/מכתבים/טיוטות/מכתב-דיקן-אישור-סוקרים-משה-בביוף-טיוטה.docx
+++ b/מכתבים/טיוטות/מכתב-דיקן-אישור-סוקרים-משה-בביוף-טיוטה.docx
@@ -62,7 +62,6 @@
       <w:pPr>
         <w:bidi/>
         <w:spacing w:before="100" w:beforeAutospacing="1" w:after="100" w:afterAutospacing="1" w:line="240" w:lineRule="auto"/>
-        <w:jc w:val="right"/>
         <w:rPr>
           <w:rFonts w:ascii="Times New Roman" w:eastAsia="Times New Roman" w:hAnsi="Times New Roman" w:cs="Times New Roman"/>
           <w:sz w:val="24"/>
@@ -84,7 +83,6 @@
       <w:pPr>
         <w:bidi/>
         <w:spacing w:before="100" w:beforeAutospacing="1" w:after="100" w:afterAutospacing="1" w:line="240" w:lineRule="auto"/>
-        <w:jc w:val="right"/>
         <w:rPr>
           <w:rFonts w:ascii="Times New Roman" w:eastAsia="Times New Roman" w:hAnsi="Times New Roman" w:cs="Times New Roman"/>
           <w:sz w:val="24"/>
@@ -106,7 +104,6 @@
       <w:pPr>
         <w:bidi/>
         <w:spacing w:before="100" w:beforeAutospacing="1" w:after="100" w:afterAutospacing="1" w:line="240" w:lineRule="auto"/>
-        <w:jc w:val="right"/>
         <w:rPr>
           <w:rFonts w:ascii="Times New Roman" w:eastAsia="Times New Roman" w:hAnsi="Times New Roman" w:cs="Times New Roman"/>
           <w:sz w:val="24"/>
@@ -140,7 +137,6 @@
       <w:pPr>
         <w:bidi/>
         <w:spacing w:before="100" w:beforeAutospacing="1" w:after="100" w:afterAutospacing="1" w:line="240" w:lineRule="auto"/>
-        <w:jc w:val="right"/>
         <w:rPr>
           <w:rFonts w:ascii="Times New Roman" w:eastAsia="Times New Roman" w:hAnsi="Times New Roman" w:cs="Times New Roman"/>
           <w:sz w:val="24"/>
@@ -176,7 +172,6 @@
       <w:pPr>
         <w:bidi/>
         <w:spacing w:before="100" w:beforeAutospacing="1" w:after="100" w:afterAutospacing="1" w:line="240" w:lineRule="auto"/>
-        <w:jc w:val="right"/>
         <w:rPr>
           <w:rFonts w:ascii="Times New Roman" w:eastAsia="Times New Roman" w:hAnsi="Times New Roman" w:cs="Times New Roman"/>
           <w:sz w:val="24"/>
@@ -198,7 +193,6 @@
       <w:pPr>
         <w:bidi/>
         <w:spacing w:before="100" w:beforeAutospacing="1" w:after="100" w:afterAutospacing="1" w:line="240" w:lineRule="auto"/>
-        <w:jc w:val="right"/>
         <w:rPr>
           <w:rFonts w:ascii="Times New Roman" w:eastAsia="Times New Roman" w:hAnsi="Times New Roman" w:cs="Times New Roman"/>
           <w:sz w:val="24"/>
@@ -220,7 +214,6 @@
       <w:pPr>
         <w:bidi/>
         <w:spacing w:before="100" w:beforeAutospacing="1" w:after="100" w:afterAutospacing="1" w:line="240" w:lineRule="auto"/>
-        <w:jc w:val="right"/>
         <w:rPr>
           <w:rFonts w:ascii="Times New Roman" w:eastAsia="Times New Roman" w:hAnsi="Times New Roman" w:cs="Times New Roman"/>
           <w:sz w:val="24"/>
@@ -242,7 +235,6 @@
       <w:pPr>
         <w:bidi/>
         <w:spacing w:before="100" w:beforeAutospacing="1" w:after="100" w:afterAutospacing="1" w:line="240" w:lineRule="auto"/>
-        <w:jc w:val="right"/>
         <w:rPr>
           <w:rFonts w:ascii="Times New Roman" w:eastAsia="Times New Roman" w:hAnsi="Times New Roman" w:cs="Times New Roman"/>
           <w:sz w:val="24"/>
@@ -928,7 +920,6 @@
       <w:pPr>
         <w:bidi/>
         <w:spacing w:before="100" w:beforeAutospacing="1" w:after="100" w:afterAutospacing="1" w:line="240" w:lineRule="auto"/>
-        <w:jc w:val="right"/>
         <w:rPr>
           <w:rFonts w:ascii="Times New Roman" w:eastAsia="Times New Roman" w:hAnsi="Times New Roman" w:cs="Times New Roman"/>
           <w:sz w:val="24"/>
@@ -962,7 +953,6 @@
       <w:pPr>
         <w:bidi/>
         <w:spacing w:before="100" w:beforeAutospacing="1" w:after="100" w:afterAutospacing="1" w:line="240" w:lineRule="auto"/>
-        <w:jc w:val="right"/>
         <w:rPr>
           <w:rFonts w:ascii="Times New Roman" w:eastAsia="Times New Roman" w:hAnsi="Times New Roman" w:cs="Times New Roman"/>
           <w:sz w:val="24"/>
@@ -984,7 +974,6 @@
       <w:pPr>
         <w:bidi/>
         <w:spacing w:before="100" w:beforeAutospacing="1" w:after="100" w:afterAutospacing="1" w:line="240" w:lineRule="auto"/>
-        <w:jc w:val="right"/>
         <w:rPr>
           <w:rFonts w:ascii="Times New Roman" w:eastAsia="Times New Roman" w:hAnsi="Times New Roman" w:cs="Times New Roman"/>
           <w:sz w:val="24"/>

</xml_diff>